<commit_message>
Project proposal: Research gap more specified
</commit_message>
<xml_diff>
--- a/project_proposal/proposal_new.docx
+++ b/project_proposal/proposal_new.docx
@@ -130,7 +130,53 @@
       </w:pPr>
       <w:r>
         <w:rPr/>
-        <w:t>Recent advances in generative modeling provide a more expressive alternative to standard learned heuristics. GFlowNets are designed to sample structured objects with probability proportional to reward, which makes them natural tools for generating diverse candidate subsets and destroy sets in solving graph problems (Bengio et al., 2022; Bengio et al., 2023; Bresich et al., 2026). Diffusion models, originally successful in image generation, have also been adapted to combinatorial optimization, where they can generate promising graph structures, improve evolutionary search, or provide candidate solutions for hard graph problems (Soler and Raidl, 2025; Wüstinger et al., 2026). These methods are especially relevant because graph optimization frequently requires not only a single optimal solution but a distribution of good, diverse candidate structures; this diversity is crucial in LNS, CMSA, and hybrid repair pipelines.</w:t>
+        <w:t xml:space="preserve">Recent advances in generative modeling provide a more expressive alternative to standard learned heuristics. </w:t>
+      </w:r>
+      <w:r>
+        <w:rPr>
+          <w:rStyle w:val="StrongEmphasis"/>
+        </w:rPr>
+        <w:t>Generative Flow Networks (GFlowNets)</w:t>
+      </w:r>
+      <w:r>
+        <w:rPr/>
+        <w:t xml:space="preserve"> learn stochastic policies for constructing structured objects with probabilities related to their reward. Unlike purely greedy policies that aim to generate one maximizer, GFlowNets are particularly suited to sampling </w:t>
+      </w:r>
+      <w:r>
+        <w:rPr>
+          <w:rStyle w:val="StrongEmphasis"/>
+        </w:rPr>
+        <w:t>diverse high-reward structur</w:t>
+      </w:r>
+      <w:r>
+        <w:rPr>
+          <w:rStyle w:val="StrongEmphasis"/>
+        </w:rPr>
+        <w:t xml:space="preserve">es. </w:t>
+      </w:r>
+      <w:r>
+        <w:rPr/>
+        <w:t xml:space="preserve">This property is highly relevant to hybrid optimization. Both CMSA and LNS benefit not only from one strong prediction but from multiple structurally different promising candidates. </w:t>
+      </w:r>
+      <w:r>
+        <w:rPr/>
+        <w:t>This</w:t>
+      </w:r>
+      <w:r>
+        <w:rPr/>
+        <w:t xml:space="preserve"> makes the </w:t>
+      </w:r>
+      <w:r>
+        <w:rPr>
+          <w:rStyle w:val="StrongEmphasis"/>
+          <w:b w:val="false"/>
+          <w:bCs w:val="false"/>
+        </w:rPr>
+        <w:t>GFlowNets</w:t>
+      </w:r>
+      <w:r>
+        <w:rPr/>
+        <w:t xml:space="preserve"> natural tools for generating diverse candidate subsets and destroy sets in solving graph problems (Bengio et al., 2022; Bengio et al., 2023; Bresich et al., 2026). </w:t>
       </w:r>
     </w:p>
     <w:p>
@@ -141,13 +187,62 @@
       </w:pPr>
       <w:r>
         <w:rPr>
+          <w:b/>
+          <w:bCs/>
+        </w:rPr>
+        <w:t>Diffusion models</w:t>
+      </w:r>
+      <w:r>
+        <w:rPr/>
+        <w:t>, originally successful in image generation, have also been adapted to combinatorial optimization, where they can generate promising graph structures,  offer a complementary generative mechani</w:t>
+      </w:r>
+      <w:r>
+        <w:rPr/>
+        <w:t>sm</w:t>
+      </w:r>
+      <w:r>
+        <w:rPr/>
+        <w:t xml:space="preserve">. Discrete and graph-based diffusion approaches progressively transform noisy structures into high-quality candidate solutions. </w:t>
+      </w:r>
+      <w:r>
+        <w:rPr/>
+        <w:t xml:space="preserve">They </w:t>
+      </w:r>
+      <w:r>
+        <w:rPr/>
+        <w:t>improv</w:t>
+      </w:r>
+      <w:r>
+        <w:rPr/>
+        <w:t>ed</w:t>
+      </w:r>
+      <w:r>
+        <w:rPr/>
+        <w:t xml:space="preserve"> evolutionary search, or provide candidate solutions for hard graph problems (Soler and Raidl, 2025; Wüstinger et al., 2026).  These methods are especially relevant because graph optimization frequently requires not only a single optimal solution but a distribution of good, diverse candidate structures; this diversity is crucial in LNS, CMSA, and hybrid repair pipelines.</w:t>
+      </w:r>
+    </w:p>
+    <w:p>
+      <w:pPr>
+        <w:pStyle w:val="Normal"/>
+        <w:jc w:val="both"/>
+        <w:rPr>
+          <w:color w:val="C9211E"/>
+        </w:rPr>
+      </w:pPr>
+      <w:r>
+        <w:rPr>
+          <w:b/>
+          <w:bCs/>
           <w:i/>
           <w:iCs/>
+          <w:color w:val="C9211E"/>
         </w:rPr>
         <w:t>Decision-focused learning</w:t>
       </w:r>
       <w:r>
-        <w:rPr/>
+        <w:rPr>
+          <w:color w:val="C9211E"/>
+        </w:rPr>
         <w:t xml:space="preserve"> (DFL) is another emerging direction. Rather than minimizing prediction error alone, DFL trains models to reduce the regret of downstream optimization decisions. This is particularly relevant in dynamic routing and resource allocation settings, where a prediction error may be harmless if it does not affect the decision quality, and harmful if it leads to bad operational choices (Mandi et al., 2024; Baty et al., 2024). The dynamic EADARP is a natural test bed because it involves future demand, charging, and time-window constraints that necessitate anticipatory decisions rather than myopic choices. Learning to schedule LNS neighborhoods, decide which request to replan, or predict future feasibility can significantly improve practical performance (Tomandl et al., 2026; Bresich et al., 2025; Bresich et al., 2026).</w:t>
       </w:r>
     </w:p>
@@ -159,7 +254,130 @@
       </w:pPr>
       <w:r>
         <w:rPr/>
-        <w:t>Despite these advances, a clear research gap remains. The literature still lacks a unified framework that tightly integrates structured search control, generative models, and classical decomposition methods in one optimization loop. In particular, most current methods either (i) rely on end-to-end neural solvers that perform poorly on hard graph instances when compared to hybrid methods, or (ii) use machine learning only as a local add-on to a heuristic without end-to-end search control. Moreover, references to LLM-based heuristic generation remain largely exploratory and are not yet embedded into a rigorous optimization pipeline for graph problems. The project addresses precisely this gap by developing a hybrid search architecture that combines classical optimization, graph-aware learning, generative models, and decision-focused control in one coherent framework.</w:t>
+        <w:t xml:space="preserve">Despite these advances, a clear research gap remains. The literature still lacks a unified framework that tightly integrates structured search control, generative models, and classical decomposition methods in one optimization loop. In particular, most current methods either (i) rely on end-to-end neural solvers that perform poorly on hard graph instances when compared to hybrid methods, or (ii) use machine learning only as a local add-on to a heuristic without end-to-end search control. Moreover, references to LLM-based heuristic generation remain largely exploratory and are  </w:t>
+      </w:r>
+      <w:r>
+        <w:rPr/>
+        <w:t>poorly</w:t>
+      </w:r>
+      <w:r>
+        <w:rPr/>
+        <w:t xml:space="preserve"> embedded into a rigorous optimization pipeline for graph problems. </w:t>
+      </w:r>
+    </w:p>
+    <w:p>
+      <w:pPr>
+        <w:pStyle w:val="TextBody"/>
+        <w:rPr/>
+      </w:pPr>
+      <w:r>
+        <w:rPr/>
+        <w:t xml:space="preserve">The proposed project addresses this gap by studying a common methodological problem: </w:t>
+      </w:r>
+      <w:r>
+        <w:rPr>
+          <w:rStyle w:val="StrongEmphasis"/>
+        </w:rPr>
+        <w:t>How can learning and generative models improve the construction and control of reduced search spaces inside hybrid metaheuristics?</w:t>
+      </w:r>
+    </w:p>
+    <w:p>
+      <w:pPr>
+        <w:pStyle w:val="TextBody"/>
+        <w:rPr/>
+      </w:pPr>
+      <w:r>
+        <w:rPr/>
+        <w:t>The project will investigate this question at three complementary levels:</w:t>
+      </w:r>
+    </w:p>
+    <w:p>
+      <w:pPr>
+        <w:pStyle w:val="TextBody"/>
+        <w:numPr>
+          <w:ilvl w:val="0"/>
+          <w:numId w:val="7"/>
+        </w:numPr>
+        <w:tabs>
+          <w:tab w:val="clear" w:pos="720"/>
+          <w:tab w:val="left" w:pos="0" w:leader="none"/>
+        </w:tabs>
+        <w:ind w:left="709" w:hanging="283"/>
+        <w:rPr/>
+      </w:pPr>
+      <w:r>
+        <w:rPr>
+          <w:rStyle w:val="StrongEmphasis"/>
+        </w:rPr>
+        <w:t xml:space="preserve">offline learning </w:t>
+      </w:r>
+      <w:r>
+        <w:rPr>
+          <w:rStyle w:val="StrongEmphasis"/>
+          <w:b w:val="false"/>
+          <w:bCs w:val="false"/>
+        </w:rPr>
+        <w:t>from previous optimization experience;</w:t>
+      </w:r>
+    </w:p>
+    <w:p>
+      <w:pPr>
+        <w:pStyle w:val="TextBody"/>
+        <w:numPr>
+          <w:ilvl w:val="0"/>
+          <w:numId w:val="7"/>
+        </w:numPr>
+        <w:tabs>
+          <w:tab w:val="clear" w:pos="720"/>
+          <w:tab w:val="left" w:pos="0" w:leader="none"/>
+        </w:tabs>
+        <w:ind w:left="709" w:hanging="283"/>
+        <w:rPr/>
+      </w:pPr>
+      <w:r>
+        <w:rPr>
+          <w:rStyle w:val="StrongEmphasis"/>
+        </w:rPr>
+        <w:t xml:space="preserve">online adaptation </w:t>
+      </w:r>
+      <w:r>
+        <w:rPr>
+          <w:rStyle w:val="StrongEmphasis"/>
+          <w:b w:val="false"/>
+          <w:bCs w:val="false"/>
+        </w:rPr>
+        <w:t>from the current search trajectory;</w:t>
+      </w:r>
+    </w:p>
+    <w:p>
+      <w:pPr>
+        <w:pStyle w:val="TextBody"/>
+        <w:numPr>
+          <w:ilvl w:val="0"/>
+          <w:numId w:val="7"/>
+        </w:numPr>
+        <w:tabs>
+          <w:tab w:val="clear" w:pos="720"/>
+          <w:tab w:val="left" w:pos="0" w:leader="none"/>
+        </w:tabs>
+        <w:ind w:left="709" w:hanging="283"/>
+        <w:rPr/>
+      </w:pPr>
+      <w:r>
+        <w:rPr>
+          <w:rStyle w:val="StrongEmphasis"/>
+        </w:rPr>
+        <w:t>generative construction and automatic heuristic discovery.</w:t>
+      </w:r>
+    </w:p>
+    <w:p>
+      <w:pPr>
+        <w:pStyle w:val="TextBody"/>
+        <w:rPr/>
+      </w:pPr>
+      <w:r>
+        <w:rPr/>
+        <w:t>Rather than attempting to develop a universal neural optimizer, the project aims to identify principles that can be transferred across different optimization frameworks and problem classes.</w:t>
       </w:r>
     </w:p>
     <w:p>
@@ -209,10 +427,14 @@
       <w:pPr>
         <w:pStyle w:val="Normal"/>
         <w:jc w:val="both"/>
-        <w:rPr/>
+        <w:rPr>
+          <w:color w:val="C9211E"/>
+        </w:rPr>
       </w:pPr>
       <w:r>
-        <w:rPr/>
+        <w:rPr>
+          <w:color w:val="C9211E"/>
+        </w:rPr>
         <w:t>(iii) To develop decision-focused learning strategies for dynamic routing and scheduling applications, especially in the context of EADARP and related online decision problems.</w:t>
       </w:r>
     </w:p>
@@ -652,242 +874,394 @@
     </w:p>
     <w:p>
       <w:pPr>
-        <w:pStyle w:val="Heading1"/>
+        <w:pStyle w:val="Normal"/>
+        <w:jc w:val="both"/>
         <w:rPr/>
       </w:pPr>
       <w:r>
         <w:rPr/>
-        <w:t>6. References (</w:t>
+        <w:t xml:space="preserve">6. </w:t>
       </w:r>
       <w:r>
         <w:rPr>
+          <w:b/>
+          <w:bCs/>
+        </w:rPr>
+        <w:t>References (</w:t>
+      </w:r>
+      <w:r>
+        <w:rPr>
+          <w:b/>
+          <w:bCs/>
           <w:color w:val="C9211E"/>
         </w:rPr>
         <w:t>TODO: update</w:t>
       </w:r>
       <w:r>
-        <w:rPr/>
+        <w:rPr>
+          <w:b/>
+          <w:bCs/>
+        </w:rPr>
         <w:t>)</w:t>
       </w:r>
     </w:p>
     <w:p>
       <w:pPr>
         <w:pStyle w:val="Normal"/>
+        <w:spacing w:lineRule="auto" w:line="240"/>
         <w:jc w:val="both"/>
-        <w:rPr/>
+        <w:rPr>
+          <w:sz w:val="18"/>
+          <w:szCs w:val="18"/>
+        </w:rPr>
       </w:pPr>
       <w:r>
-        <w:rPr/>
+        <w:rPr>
+          <w:sz w:val="18"/>
+          <w:szCs w:val="18"/>
+        </w:rPr>
         <w:t>[1] Y. Bengio, E. J. Hu, and colleagues, Generative flow networks: a new way to sample structured objects, NeurIPS 2022.</w:t>
       </w:r>
     </w:p>
     <w:p>
       <w:pPr>
         <w:pStyle w:val="Normal"/>
+        <w:spacing w:lineRule="auto" w:line="240"/>
         <w:jc w:val="both"/>
-        <w:rPr/>
+        <w:rPr>
+          <w:sz w:val="18"/>
+          <w:szCs w:val="18"/>
+        </w:rPr>
       </w:pPr>
       <w:r>
-        <w:rPr/>
+        <w:rPr>
+          <w:sz w:val="18"/>
+          <w:szCs w:val="18"/>
+        </w:rPr>
         <w:t>[2] Y. Bengio, S. Lahlou, T. Deleu, Y. B. Ji, and others, GFlowNets and variational inference for structured generation, arXiv:2023.</w:t>
       </w:r>
     </w:p>
     <w:p>
       <w:pPr>
         <w:pStyle w:val="Normal"/>
+        <w:spacing w:lineRule="auto" w:line="240"/>
         <w:jc w:val="both"/>
-        <w:rPr/>
+        <w:rPr>
+          <w:sz w:val="18"/>
+          <w:szCs w:val="18"/>
+        </w:rPr>
       </w:pPr>
       <w:r>
-        <w:rPr/>
+        <w:rPr>
+          <w:sz w:val="18"/>
+          <w:szCs w:val="18"/>
+        </w:rPr>
         <w:t>[3] C. Blum and A. Roli, Metaheuristics in combinatorial optimization: overview and conceptual comparisons, ACM Computing Surveys, 2003.</w:t>
       </w:r>
     </w:p>
     <w:p>
       <w:pPr>
         <w:pStyle w:val="Normal"/>
+        <w:spacing w:lineRule="auto" w:line="240"/>
         <w:jc w:val="both"/>
-        <w:rPr/>
+        <w:rPr>
+          <w:sz w:val="18"/>
+          <w:szCs w:val="18"/>
+        </w:rPr>
       </w:pPr>
       <w:r>
-        <w:rPr/>
+        <w:rPr>
+          <w:sz w:val="18"/>
+          <w:szCs w:val="18"/>
+        </w:rPr>
         <w:t>[4] L. Baty, K. Jungel, P. S. Klein, A. Parmentier, and M. Schiffer, Combinatorial optimization-enriched machine learning to solve the dynamic vehicle routing problem with time windows, Transportation Science, 2024.</w:t>
       </w:r>
     </w:p>
     <w:p>
       <w:pPr>
         <w:pStyle w:val="Normal"/>
+        <w:spacing w:lineRule="auto" w:line="240"/>
         <w:jc w:val="both"/>
-        <w:rPr/>
+        <w:rPr>
+          <w:sz w:val="18"/>
+          <w:szCs w:val="18"/>
+        </w:rPr>
       </w:pPr>
       <w:r>
-        <w:rPr/>
+        <w:rPr>
+          <w:sz w:val="18"/>
+          <w:szCs w:val="18"/>
+        </w:rPr>
         <w:t>[5] M. A. Akbay, C. Blum, and G. R. Raidl, A hybrid CMSA–column generation approach to variable-sized bin packing, ECAI 2025.</w:t>
       </w:r>
     </w:p>
     <w:p>
       <w:pPr>
         <w:pStyle w:val="Normal"/>
+        <w:spacing w:lineRule="auto" w:line="240"/>
         <w:jc w:val="both"/>
-        <w:rPr/>
+        <w:rPr>
+          <w:sz w:val="18"/>
+          <w:szCs w:val="18"/>
+        </w:rPr>
       </w:pPr>
       <w:r>
-        <w:rPr/>
+        <w:rPr>
+          <w:sz w:val="18"/>
+          <w:szCs w:val="18"/>
+        </w:rPr>
         <w:t>[6] M. Bresich, G. R. Raidl, and S. Limmer, Revisiting large neighborhood search with on-the-fly charging station insertion for the electric autonomous dial-a-ride problem, 2025.</w:t>
       </w:r>
     </w:p>
     <w:p>
       <w:pPr>
         <w:pStyle w:val="Normal"/>
+        <w:spacing w:lineRule="auto" w:line="240"/>
         <w:jc w:val="both"/>
-        <w:rPr/>
+        <w:rPr>
+          <w:sz w:val="18"/>
+          <w:szCs w:val="18"/>
+        </w:rPr>
       </w:pPr>
       <w:r>
-        <w:rPr/>
+        <w:rPr>
+          <w:sz w:val="18"/>
+          <w:szCs w:val="18"/>
+        </w:rPr>
         <w:t>[7] M. Bresich, J. Peng, G. R. Raidl, and S. Limmer, Determining destroy sets in large neighborhood search by generative flow networks, 2026.</w:t>
       </w:r>
     </w:p>
     <w:p>
       <w:pPr>
         <w:pStyle w:val="Normal"/>
+        <w:spacing w:lineRule="auto" w:line="240"/>
         <w:jc w:val="both"/>
-        <w:rPr/>
+        <w:rPr>
+          <w:sz w:val="18"/>
+          <w:szCs w:val="18"/>
+        </w:rPr>
       </w:pPr>
       <w:r>
-        <w:rPr/>
+        <w:rPr>
+          <w:sz w:val="18"/>
+          <w:szCs w:val="18"/>
+        </w:rPr>
         <w:t>[8] M. Bresich, G. R. Raidl, C. Coleman, P. Welke, and S. Limmer, Search space reduction through machine learning for the electric autonomous dial-a-ride problem, 2026.</w:t>
       </w:r>
     </w:p>
     <w:p>
       <w:pPr>
         <w:pStyle w:val="Normal"/>
+        <w:spacing w:lineRule="auto" w:line="240"/>
         <w:jc w:val="both"/>
-        <w:rPr/>
+        <w:rPr>
+          <w:sz w:val="18"/>
+          <w:szCs w:val="18"/>
+        </w:rPr>
       </w:pPr>
       <w:r>
-        <w:rPr/>
+        <w:rPr>
+          <w:sz w:val="18"/>
+          <w:szCs w:val="18"/>
+        </w:rPr>
         <w:t>[9] J. Reixach and C. Blum, How to improve Construct, Merge, Solve and Adapt? Use reinforcement learning!, Annals of Operations Research, 2024.</w:t>
       </w:r>
     </w:p>
     <w:p>
       <w:pPr>
         <w:pStyle w:val="Normal"/>
+        <w:spacing w:lineRule="auto" w:line="240"/>
         <w:jc w:val="both"/>
-        <w:rPr/>
+        <w:rPr>
+          <w:sz w:val="18"/>
+          <w:szCs w:val="18"/>
+        </w:rPr>
       </w:pPr>
       <w:r>
-        <w:rPr/>
+        <w:rPr>
+          <w:sz w:val="18"/>
+          <w:szCs w:val="18"/>
+        </w:rPr>
         <w:t>[10] J. Reixach and C. Blum, Improving the CMSA algorithm with online deep learning, ECAI 2025.</w:t>
       </w:r>
     </w:p>
     <w:p>
       <w:pPr>
         <w:pStyle w:val="Normal"/>
+        <w:spacing w:lineRule="auto" w:line="240"/>
         <w:jc w:val="both"/>
-        <w:rPr/>
+        <w:rPr>
+          <w:sz w:val="18"/>
+          <w:szCs w:val="18"/>
+        </w:rPr>
       </w:pPr>
       <w:r>
-        <w:rPr/>
+        <w:rPr>
+          <w:sz w:val="18"/>
+          <w:szCs w:val="18"/>
+        </w:rPr>
         <w:t>[11] A. Lodi and A. Prouvost, Learning to optimize: a survey of modern approaches, Operations Research, 2022.</w:t>
       </w:r>
     </w:p>
     <w:p>
       <w:pPr>
         <w:pStyle w:val="Normal"/>
+        <w:spacing w:lineRule="auto" w:line="240"/>
         <w:jc w:val="both"/>
-        <w:rPr/>
+        <w:rPr>
+          <w:sz w:val="18"/>
+          <w:szCs w:val="18"/>
+        </w:rPr>
       </w:pPr>
       <w:r>
-        <w:rPr/>
+        <w:rPr>
+          <w:sz w:val="18"/>
+          <w:szCs w:val="18"/>
+        </w:rPr>
         <w:t>[12] J. Mandi, A. G. G. de Sousa, F. D. H. de Witte, T. M. B. ..., and others, Decision-focused learning: foundations, state of the art, benchmark and future opportunities, Journal of Artificial Intelligence Research, 2024.</w:t>
       </w:r>
     </w:p>
     <w:p>
       <w:pPr>
         <w:pStyle w:val="Normal"/>
+        <w:spacing w:lineRule="auto" w:line="240"/>
         <w:jc w:val="both"/>
-        <w:rPr/>
+        <w:rPr>
+          <w:sz w:val="18"/>
+          <w:szCs w:val="18"/>
+        </w:rPr>
       </w:pPr>
       <w:r>
-        <w:rPr/>
+        <w:rPr>
+          <w:sz w:val="18"/>
+          <w:szCs w:val="18"/>
+        </w:rPr>
         <w:t>[13] X. Liu, Y. Wang, and others, LLM-driven optimization and algorithm synthesis, 2024.</w:t>
       </w:r>
     </w:p>
     <w:p>
       <w:pPr>
         <w:pStyle w:val="Normal"/>
+        <w:spacing w:lineRule="auto" w:line="240"/>
         <w:jc w:val="both"/>
-        <w:rPr/>
+        <w:rPr>
+          <w:sz w:val="18"/>
+          <w:szCs w:val="18"/>
+        </w:rPr>
       </w:pPr>
       <w:r>
-        <w:rPr/>
+        <w:rPr>
+          <w:sz w:val="18"/>
+          <w:szCs w:val="18"/>
+        </w:rPr>
         <w:t>[14] F. Glover and G. Kochenberger, Handbook of Metaheuristics, Springer, 2003.</w:t>
       </w:r>
     </w:p>
     <w:p>
       <w:pPr>
         <w:pStyle w:val="Normal"/>
+        <w:spacing w:lineRule="auto" w:line="240"/>
         <w:jc w:val="both"/>
-        <w:rPr/>
+        <w:rPr>
+          <w:sz w:val="18"/>
+          <w:szCs w:val="18"/>
+        </w:rPr>
       </w:pPr>
       <w:r>
-        <w:rPr/>
+        <w:rPr>
+          <w:sz w:val="18"/>
+          <w:szCs w:val="18"/>
+        </w:rPr>
         <w:t>[15] P. Toth and D. Vigo, The Vehicle Routing Problem, SIAM, 2002.</w:t>
       </w:r>
     </w:p>
     <w:p>
       <w:pPr>
         <w:pStyle w:val="Normal"/>
+        <w:spacing w:lineRule="auto" w:line="240"/>
         <w:jc w:val="both"/>
-        <w:rPr/>
+        <w:rPr>
+          <w:sz w:val="18"/>
+          <w:szCs w:val="18"/>
+        </w:rPr>
       </w:pPr>
       <w:r>
-        <w:rPr/>
+        <w:rPr>
+          <w:sz w:val="18"/>
+          <w:szCs w:val="18"/>
+        </w:rPr>
         <w:t>[16] J. Salvà Soler and G. R. Raidl, A denoising diffusion-based evolutionary algorithm framework: application to the maximum independent set problem, arXiv:2510.08627v1, 2025.</w:t>
       </w:r>
     </w:p>
     <w:p>
       <w:pPr>
         <w:pStyle w:val="Normal"/>
+        <w:spacing w:lineRule="auto" w:line="240"/>
         <w:jc w:val="both"/>
-        <w:rPr/>
+        <w:rPr>
+          <w:sz w:val="18"/>
+          <w:szCs w:val="18"/>
+        </w:rPr>
       </w:pPr>
       <w:r>
-        <w:rPr/>
+        <w:rPr>
+          <w:sz w:val="18"/>
+          <w:szCs w:val="18"/>
+        </w:rPr>
         <w:t>[17] M. Wüstinger, E. Iurlano, and G. R. Raidl, A denoising diffusion adaptive search for the α-domination problem on social graphs, 2026.</w:t>
       </w:r>
     </w:p>
     <w:p>
       <w:pPr>
         <w:pStyle w:val="Normal"/>
+        <w:spacing w:lineRule="auto" w:line="240"/>
         <w:jc w:val="both"/>
-        <w:rPr/>
+        <w:rPr>
+          <w:sz w:val="18"/>
+          <w:szCs w:val="18"/>
+        </w:rPr>
       </w:pPr>
       <w:r>
-        <w:rPr/>
+        <w:rPr>
+          <w:sz w:val="18"/>
+          <w:szCs w:val="18"/>
+        </w:rPr>
         <w:t>[18] L. Tomandl, M. Bresich, G. R. Raidl, Y. Mei, S. Limmer, and T. Rodemann, A reinforcement learning guided large neighborhood search for the dynamic electric autonomous dial-a-ride problem, 2026.</w:t>
       </w:r>
     </w:p>
     <w:p>
       <w:pPr>
         <w:pStyle w:val="Normal"/>
+        <w:spacing w:lineRule="auto" w:line="240"/>
         <w:jc w:val="both"/>
-        <w:rPr/>
+        <w:rPr>
+          <w:sz w:val="18"/>
+          <w:szCs w:val="18"/>
+        </w:rPr>
       </w:pPr>
       <w:r>
-        <w:rPr/>
+        <w:rPr>
+          <w:sz w:val="18"/>
+          <w:szCs w:val="18"/>
+        </w:rPr>
         <w:t>[19] F. Odelga, E. Iurlano, and G. R. Raidl, A Construct Merge Solve and Adapt heuristic for least cost influence maximization, 2026 (submitted)</w:t>
       </w:r>
     </w:p>
     <w:p>
       <w:pPr>
         <w:pStyle w:val="Normal"/>
-        <w:spacing w:before="0" w:after="200"/>
+        <w:spacing w:lineRule="auto" w:line="240" w:before="0" w:after="200"/>
         <w:jc w:val="both"/>
-        <w:rPr/>
+        <w:rPr>
+          <w:sz w:val="18"/>
+          <w:szCs w:val="18"/>
+        </w:rPr>
       </w:pPr>
       <w:r>
-        <w:rPr/>
+        <w:rPr>
+          <w:sz w:val="18"/>
+          <w:szCs w:val="18"/>
+        </w:rPr>
         <w:t>[20] J. Yang, X. Wang, and others, Large language models as optimizers, arXiv preprint, 2023.</w:t>
       </w:r>
     </w:p>
@@ -1629,6 +2003,125 @@
   <w:abstractNum w:abstractNumId="7">
     <w:lvl w:ilvl="0">
       <w:start w:val="1"/>
+      <w:numFmt w:val="decimal"/>
+      <w:lvlText w:val="%1."/>
+      <w:lvlJc w:val="left"/>
+      <w:pPr>
+        <w:tabs>
+          <w:tab w:val="num" w:pos="709"/>
+        </w:tabs>
+        <w:ind w:left="709" w:hanging="283"/>
+      </w:pPr>
+      <w:rPr/>
+    </w:lvl>
+    <w:lvl w:ilvl="1">
+      <w:start w:val="1"/>
+      <w:numFmt w:val="decimal"/>
+      <w:lvlText w:val="%2."/>
+      <w:lvlJc w:val="left"/>
+      <w:pPr>
+        <w:tabs>
+          <w:tab w:val="num" w:pos="1418"/>
+        </w:tabs>
+        <w:ind w:left="1418" w:hanging="283"/>
+      </w:pPr>
+      <w:rPr/>
+    </w:lvl>
+    <w:lvl w:ilvl="2">
+      <w:start w:val="1"/>
+      <w:numFmt w:val="decimal"/>
+      <w:lvlText w:val="%3."/>
+      <w:lvlJc w:val="left"/>
+      <w:pPr>
+        <w:tabs>
+          <w:tab w:val="num" w:pos="2127"/>
+        </w:tabs>
+        <w:ind w:left="2127" w:hanging="283"/>
+      </w:pPr>
+      <w:rPr/>
+    </w:lvl>
+    <w:lvl w:ilvl="3">
+      <w:start w:val="1"/>
+      <w:numFmt w:val="decimal"/>
+      <w:lvlText w:val="%4."/>
+      <w:lvlJc w:val="left"/>
+      <w:pPr>
+        <w:tabs>
+          <w:tab w:val="num" w:pos="2836"/>
+        </w:tabs>
+        <w:ind w:left="2836" w:hanging="283"/>
+      </w:pPr>
+      <w:rPr/>
+    </w:lvl>
+    <w:lvl w:ilvl="4">
+      <w:start w:val="1"/>
+      <w:numFmt w:val="decimal"/>
+      <w:lvlText w:val="%5."/>
+      <w:lvlJc w:val="left"/>
+      <w:pPr>
+        <w:tabs>
+          <w:tab w:val="num" w:pos="3545"/>
+        </w:tabs>
+        <w:ind w:left="3545" w:hanging="283"/>
+      </w:pPr>
+      <w:rPr/>
+    </w:lvl>
+    <w:lvl w:ilvl="5">
+      <w:start w:val="1"/>
+      <w:numFmt w:val="decimal"/>
+      <w:lvlText w:val="%6."/>
+      <w:lvlJc w:val="left"/>
+      <w:pPr>
+        <w:tabs>
+          <w:tab w:val="num" w:pos="4254"/>
+        </w:tabs>
+        <w:ind w:left="4254" w:hanging="283"/>
+      </w:pPr>
+      <w:rPr/>
+    </w:lvl>
+    <w:lvl w:ilvl="6">
+      <w:start w:val="1"/>
+      <w:numFmt w:val="decimal"/>
+      <w:lvlText w:val="%7."/>
+      <w:lvlJc w:val="left"/>
+      <w:pPr>
+        <w:tabs>
+          <w:tab w:val="num" w:pos="4963"/>
+        </w:tabs>
+        <w:ind w:left="4963" w:hanging="283"/>
+      </w:pPr>
+      <w:rPr/>
+    </w:lvl>
+    <w:lvl w:ilvl="7">
+      <w:start w:val="1"/>
+      <w:numFmt w:val="decimal"/>
+      <w:lvlText w:val="%8."/>
+      <w:lvlJc w:val="left"/>
+      <w:pPr>
+        <w:tabs>
+          <w:tab w:val="num" w:pos="5672"/>
+        </w:tabs>
+        <w:ind w:left="5672" w:hanging="283"/>
+      </w:pPr>
+      <w:rPr/>
+    </w:lvl>
+    <w:lvl w:ilvl="8">
+      <w:start w:val="1"/>
+      <w:numFmt w:val="decimal"/>
+      <w:lvlText w:val="%9."/>
+      <w:lvlJc w:val="left"/>
+      <w:pPr>
+        <w:tabs>
+          <w:tab w:val="num" w:pos="6381"/>
+        </w:tabs>
+        <w:ind w:left="6381" w:hanging="283"/>
+      </w:pPr>
+      <w:rPr/>
+    </w:lvl>
+  </w:abstractNum>
+  <w:abstractNum w:abstractNumId="8">
+    <w:lvl w:ilvl="0">
+      <w:start w:val="1"/>
       <w:numFmt w:val="none"/>
       <w:suff w:val="nothing"/>
       <w:lvlText w:val=""/>
@@ -1765,6 +2258,9 @@
   </w:num>
   <w:num w:numId="7">
     <w:abstractNumId w:val="7"/>
+  </w:num>
+  <w:num w:numId="8">
+    <w:abstractNumId w:val="8"/>
   </w:num>
 </w:numbering>
 </file>
@@ -2517,6 +3013,11 @@
       <w:bCs/>
     </w:rPr>
   </w:style>
+  <w:style w:type="character" w:styleId="NumberingSymbols">
+    <w:name w:val="Numbering Symbols"/>
+    <w:qFormat/>
+    <w:rPr/>
+  </w:style>
   <w:style w:type="paragraph" w:styleId="Heading">
     <w:name w:val="Heading"/>
     <w:basedOn w:val="Normal"/>
@@ -2997,6 +3498,16 @@
     <w:rsid w:val="00fc693f"/>
     <w:pPr>
       <w:outlineLvl w:val="9"/>
+    </w:pPr>
+    <w:rPr/>
+  </w:style>
+  <w:style w:type="paragraph" w:styleId="Quotations">
+    <w:name w:val="Quotations"/>
+    <w:basedOn w:val="Normal"/>
+    <w:qFormat/>
+    <w:pPr>
+      <w:spacing w:before="0" w:after="283"/>
+      <w:ind w:left="567" w:right="567" w:hanging="0"/>
     </w:pPr>
     <w:rPr/>
   </w:style>

</xml_diff>